<commit_message>
fixing formatting of cover letters
</commit_message>
<xml_diff>
--- a/templates/default_cover_letter_template.docx
+++ b/templates/default_cover_letter_template.docx
@@ -1,10 +1,14 @@
 
 <file path=word/document.xml><?xml version="1.0" encoding="utf-8"?>
-<w:document xmlns:mc="http://schemas.openxmlformats.org/markup-compatibility/2006" xmlns:ve="http://schemas.openxmlformats.org/markup-compatibility/2006" xmlns:o="urn:schemas-microsoft-com:office:office" xmlns:r="http://schemas.openxmlformats.org/officeDocument/2006/relationships" xmlns:m="http://schemas.openxmlformats.org/officeDocument/2006/math" xmlns:v="urn:schemas-microsoft-com:vml" xmlns:wp="http://schemas.openxmlformats.org/drawingml/2006/wordprocessingDrawing" xmlns:w10="urn:schemas-microsoft-com:office:word" xmlns:w="http://schemas.openxmlformats.org/wordprocessingml/2006/main" xmlns:wne="http://schemas.microsoft.com/office/word/2006/wordml" xmlns:a="http://schemas.openxmlformats.org/drawingml/2006/main" xmlns:pic="http://schemas.openxmlformats.org/drawingml/2006/picture" xmlns:wpg="http://schemas.microsoft.com/office/word/2010/wordprocessingGroup" xmlns:wps="http://schemas.microsoft.com/office/word/2010/wordprocessingShape" xmlns:w14="http://schemas.microsoft.com/office/word/2010/wordml" mc:Ignorable="w14" xml:space="preserve">
+<w:document xmlns:o="urn:schemas-microsoft-com:office:office" xmlns:r="http://schemas.openxmlformats.org/officeDocument/2006/relationships" xmlns:v="urn:schemas-microsoft-com:vml" xmlns:w="http://schemas.openxmlformats.org/wordprocessingml/2006/main" xmlns:w10="urn:schemas-microsoft-com:office:word" xmlns:wp="http://schemas.openxmlformats.org/drawingml/2006/wordprocessingDrawing" xmlns:wps="http://schemas.microsoft.com/office/word/2010/wordprocessingShape" xmlns:wpg="http://schemas.microsoft.com/office/word/2010/wordprocessingGroup" xmlns:mc="http://schemas.openxmlformats.org/markup-compatibility/2006" xmlns:wp14="http://schemas.microsoft.com/office/word/2010/wordprocessingDrawing" xmlns:w14="http://schemas.microsoft.com/office/word/2010/wordml" xmlns:w15="http://schemas.microsoft.com/office/word/2012/wordml" mc:Ignorable="w14 wp14 w15">
   <w:body>
     <w:p>
       <w:pPr>
         <w:pStyle w:val="Heading2"/>
+        <w:spacing w:before="60" w:after="0"/>
+        <w:ind w:right="358"/>
+        <w:jc w:val="center"/>
+        <w:rPr/>
       </w:pPr>
       <w:r>
         <w:rPr/>
@@ -14,7 +18,7 @@
         <w:rPr>
           <w:spacing w:val="-17"/>
         </w:rPr>
-        <w:t> </w:t>
+        <w:t xml:space="preserve"> </w:t>
       </w:r>
       <w:r>
         <w:rPr>
@@ -26,8 +30,9 @@
     <w:p>
       <w:pPr>
         <w:pStyle w:val="BodyText"/>
-        <w:spacing w:line="720" w:lineRule="auto" w:before="0"/>
-        <w:ind w:left="330" w:hanging="4"/>
+        <w:spacing w:lineRule="auto" w:line="720" w:before="0" w:after="0"/>
+        <w:ind w:hanging="4" w:left="330" w:right="0"/>
+        <w:rPr/>
       </w:pPr>
       <w:r>
         <w:rPr/>
@@ -37,7 +42,7 @@
         <w:rPr>
           <w:spacing w:val="-5"/>
         </w:rPr>
-        <w:t> </w:t>
+        <w:t xml:space="preserve"> </w:t>
       </w:r>
       <w:r>
         <w:rPr/>
@@ -47,7 +52,7 @@
         <w:rPr>
           <w:spacing w:val="-5"/>
         </w:rPr>
-        <w:t> </w:t>
+        <w:t xml:space="preserve"> </w:t>
       </w:r>
       <w:r>
         <w:rPr/>
@@ -57,7 +62,7 @@
         <w:rPr>
           <w:spacing w:val="-5"/>
         </w:rPr>
-        <w:t> </w:t>
+        <w:t xml:space="preserve"> </w:t>
       </w:r>
       <w:r>
         <w:rPr/>
@@ -67,69 +72,62 @@
         <w:rPr>
           <w:spacing w:val="-5"/>
         </w:rPr>
-        <w:t> </w:t>
-      </w:r>
-      <w:hyperlink r:id="rId5">
+        <w:t xml:space="preserve"> </w:t>
+      </w:r>
+      <w:hyperlink r:id="rId2">
         <w:r>
-          <w:rPr/>
-          <w:t>wolfie.seawolf@stonybrook.edu</w:t>
+          <w:rPr>
+            <w:rStyle w:val="ListLabel1"/>
+          </w:rPr>
+          <w:t>wolfie.seawolf@</w:t>
         </w:r>
       </w:hyperlink>
       <w:r>
+        <w:rPr/>
+        <w:t>gmail.com</w:t>
+      </w:r>
+      <w:r>
         <w:rPr>
           <w:spacing w:val="-5"/>
         </w:rPr>
-        <w:t> </w:t>
-      </w:r>
-      <w:r>
-        <w:rPr/>
-        <w:t>|</w:t>
+        <w:t xml:space="preserve"> </w:t>
+      </w:r>
+      <w:r>
+        <w:rPr/>
+        <w:t>(XXX)</w:t>
       </w:r>
       <w:r>
         <w:rPr>
           <w:spacing w:val="-5"/>
         </w:rPr>
-        <w:t> </w:t>
-      </w:r>
-      <w:r>
-        <w:rPr/>
-        <w:t>(XXX)</w:t>
+        <w:t xml:space="preserve"> </w:t>
+      </w:r>
+      <w:r>
+        <w:rPr/>
+        <w:t>XXX-XXXX</w:t>
       </w:r>
       <w:r>
         <w:rPr>
           <w:spacing w:val="-5"/>
         </w:rPr>
-        <w:t> </w:t>
-      </w:r>
-      <w:r>
-        <w:rPr/>
-        <w:t>XXX-XXXX</w:t>
-      </w:r>
-      <w:r>
-        <w:rPr>
-          <w:spacing w:val="-5"/>
-        </w:rPr>
-        <w:t> </w:t>
-      </w:r>
-      <w:r>
-        <w:rPr/>
-        <w:t>|linkedin.com/wolfie-</w:t>
-      </w:r>
-      <w:r>
-        <w:rPr/>
-        <w:t>seawolf January 1, 2024</w:t>
+        <w:t xml:space="preserve"> </w:t>
+      </w:r>
+      <w:r>
+        <w:rPr/>
+        <w:t>|linkedin.com/wolfie-seawolf January 1, 2024</w:t>
       </w:r>
     </w:p>
     <w:p>
       <w:pPr>
         <w:pStyle w:val="BodyText"/>
-        <w:spacing w:before="0"/>
+        <w:spacing w:before="0" w:after="0"/>
+        <w:rPr/>
       </w:pPr>
       <w:r>
         <w:rPr>
           <w:color w:val="212121"/>
         </w:rPr>
-        <w:t>Company </w:t>
+        <w:t xml:space="preserve">Company </w:t>
       </w:r>
       <w:r>
         <w:rPr>
@@ -142,31 +140,27 @@
     <w:p>
       <w:pPr>
         <w:pStyle w:val="BodyText"/>
-        <w:spacing w:before="0"/>
-        <w:ind w:right="7977"/>
+        <w:spacing w:before="0" w:after="0"/>
+        <w:ind w:left="360" w:right="7977"/>
+        <w:rPr/>
       </w:pPr>
       <w:r>
         <w:rPr/>
-        <w:t>XXXX Employer </w:t>
+        <w:t xml:space="preserve">XXXX Employer </w:t>
       </w:r>
       <w:r>
         <w:rPr>
           <w:spacing w:val="-5"/>
         </w:rPr>
-        <w:t>Rd</w:t>
-      </w:r>
-      <w:r>
-        <w:rPr>
-          <w:spacing w:val="-5"/>
-        </w:rPr>
-        <w:t>.</w:t>
+        <w:t>Rd.</w:t>
       </w:r>
     </w:p>
     <w:p>
       <w:pPr>
         <w:pStyle w:val="BodyText"/>
-        <w:spacing w:before="0"/>
-        <w:ind w:right="7977"/>
+        <w:spacing w:before="0" w:after="0"/>
+        <w:ind w:left="360" w:right="7977"/>
+        <w:rPr/>
       </w:pPr>
       <w:r>
         <w:rPr/>
@@ -176,7 +170,7 @@
         <w:rPr>
           <w:spacing w:val="-9"/>
         </w:rPr>
-        <w:t> </w:t>
+        <w:t xml:space="preserve"> </w:t>
       </w:r>
       <w:r>
         <w:rPr/>
@@ -186,7 +180,7 @@
         <w:rPr>
           <w:spacing w:val="-8"/>
         </w:rPr>
-        <w:t> </w:t>
+        <w:t xml:space="preserve"> </w:t>
       </w:r>
       <w:r>
         <w:rPr/>
@@ -196,7 +190,7 @@
         <w:rPr>
           <w:spacing w:val="-8"/>
         </w:rPr>
-        <w:t> </w:t>
+        <w:t xml:space="preserve"> </w:t>
       </w:r>
       <w:r>
         <w:rPr>
@@ -208,10 +202,11 @@
     <w:p>
       <w:pPr>
         <w:pStyle w:val="BodyText"/>
+        <w:rPr/>
       </w:pPr>
       <w:r>
         <w:rPr/>
-        <w:t>Dear Hiring </w:t>
+        <w:t xml:space="preserve">Dear Hiring </w:t>
       </w:r>
       <w:r>
         <w:rPr>
@@ -223,36 +218,36 @@
     <w:p>
       <w:pPr>
         <w:pStyle w:val="BodyText"/>
-        <w:ind w:right="824"/>
+        <w:ind w:left="360" w:right="824"/>
+        <w:rPr/>
       </w:pPr>
       <w:r>
         <w:rPr>
-          <w:b/>
+          <w:b w:val="false"/>
+          <w:bCs w:val="false"/>
         </w:rPr>
         <w:t>Section</w:t>
       </w:r>
       <w:r>
         <w:rPr>
-          <w:b/>
-          <w:spacing w:val="-4"/>
-        </w:rPr>
-        <w:t> </w:t>
-      </w:r>
-      <w:r>
-        <w:rPr>
-          <w:b/>
-        </w:rPr>
-        <w:t>One</w:t>
-      </w:r>
-      <w:r>
-        <w:rPr/>
-        <w:t>:</w:t>
-      </w:r>
-      <w:r>
-        <w:rPr>
-          <w:spacing w:val="-4"/>
-        </w:rPr>
-        <w:t> </w:t>
+          <w:b w:val="false"/>
+          <w:bCs w:val="false"/>
+          <w:spacing w:val="-4"/>
+        </w:rPr>
+        <w:t xml:space="preserve"> </w:t>
+      </w:r>
+      <w:r>
+        <w:rPr>
+          <w:b w:val="false"/>
+          <w:bCs w:val="false"/>
+        </w:rPr>
+        <w:t>One:</w:t>
+      </w:r>
+      <w:r>
+        <w:rPr>
+          <w:spacing w:val="-4"/>
+        </w:rPr>
+        <w:t xml:space="preserve"> </w:t>
       </w:r>
       <w:r>
         <w:rPr/>
@@ -262,7 +257,7 @@
         <w:rPr>
           <w:spacing w:val="-4"/>
         </w:rPr>
-        <w:t> </w:t>
+        <w:t xml:space="preserve"> </w:t>
       </w:r>
       <w:r>
         <w:rPr/>
@@ -272,7 +267,7 @@
         <w:rPr>
           <w:spacing w:val="-4"/>
         </w:rPr>
-        <w:t> </w:t>
+        <w:t xml:space="preserve"> </w:t>
       </w:r>
       <w:r>
         <w:rPr/>
@@ -282,7 +277,7 @@
         <w:rPr>
           <w:spacing w:val="40"/>
         </w:rPr>
-        <w:t> </w:t>
+        <w:t xml:space="preserve"> </w:t>
       </w:r>
       <w:r>
         <w:rPr/>
@@ -292,7 +287,7 @@
         <w:rPr>
           <w:spacing w:val="-4"/>
         </w:rPr>
-        <w:t> </w:t>
+        <w:t xml:space="preserve"> </w:t>
       </w:r>
       <w:r>
         <w:rPr/>
@@ -302,7 +297,7 @@
         <w:rPr>
           <w:spacing w:val="-4"/>
         </w:rPr>
-        <w:t> </w:t>
+        <w:t xml:space="preserve"> </w:t>
       </w:r>
       <w:r>
         <w:rPr/>
@@ -312,7 +307,7 @@
         <w:rPr>
           <w:spacing w:val="-4"/>
         </w:rPr>
-        <w:t> </w:t>
+        <w:t xml:space="preserve"> </w:t>
       </w:r>
       <w:r>
         <w:rPr/>
@@ -322,7 +317,7 @@
         <w:rPr>
           <w:spacing w:val="-4"/>
         </w:rPr>
-        <w:t> </w:t>
+        <w:t xml:space="preserve"> </w:t>
       </w:r>
       <w:r>
         <w:rPr/>
@@ -332,7 +327,7 @@
         <w:rPr>
           <w:spacing w:val="-4"/>
         </w:rPr>
-        <w:t> </w:t>
+        <w:t xml:space="preserve"> </w:t>
       </w:r>
       <w:r>
         <w:rPr/>
@@ -342,7 +337,7 @@
         <w:rPr>
           <w:spacing w:val="-4"/>
         </w:rPr>
-        <w:t> </w:t>
+        <w:t xml:space="preserve"> </w:t>
       </w:r>
       <w:r>
         <w:rPr/>
@@ -352,7 +347,7 @@
         <w:rPr>
           <w:spacing w:val="-4"/>
         </w:rPr>
-        <w:t> </w:t>
+        <w:t xml:space="preserve"> </w:t>
       </w:r>
       <w:r>
         <w:rPr/>
@@ -362,7 +357,7 @@
         <w:rPr>
           <w:spacing w:val="-4"/>
         </w:rPr>
-        <w:t> </w:t>
+        <w:t xml:space="preserve"> </w:t>
       </w:r>
       <w:r>
         <w:rPr/>
@@ -372,36 +367,38 @@
     <w:p>
       <w:pPr>
         <w:pStyle w:val="BodyText"/>
-        <w:ind w:right="824"/>
+        <w:ind w:left="360" w:right="824"/>
+        <w:rPr/>
       </w:pPr>
       <w:r>
         <w:rPr>
-          <w:b/>
+          <w:b w:val="false"/>
+          <w:bCs w:val="false"/>
         </w:rPr>
         <w:t>Section</w:t>
       </w:r>
       <w:r>
         <w:rPr>
-          <w:b/>
-          <w:spacing w:val="-4"/>
-        </w:rPr>
-        <w:t> </w:t>
-      </w:r>
-      <w:r>
-        <w:rPr>
-          <w:b/>
-        </w:rPr>
-        <w:t>Two</w:t>
-      </w:r>
-      <w:r>
-        <w:rPr/>
-        <w:t>:</w:t>
-      </w:r>
-      <w:r>
-        <w:rPr>
-          <w:spacing w:val="-4"/>
-        </w:rPr>
-        <w:t> </w:t>
+          <w:b w:val="false"/>
+          <w:bCs w:val="false"/>
+          <w:spacing w:val="-4"/>
+        </w:rPr>
+        <w:t xml:space="preserve"> </w:t>
+      </w:r>
+      <w:r>
+        <w:rPr>
+          <w:b w:val="false"/>
+          <w:bCs w:val="false"/>
+        </w:rPr>
+        <w:t>Two:</w:t>
+      </w:r>
+      <w:r>
+        <w:rPr>
+          <w:b w:val="false"/>
+          <w:bCs w:val="false"/>
+          <w:spacing w:val="-4"/>
+        </w:rPr>
+        <w:t xml:space="preserve"> </w:t>
       </w:r>
       <w:r>
         <w:rPr/>
@@ -411,7 +408,7 @@
         <w:rPr>
           <w:spacing w:val="-4"/>
         </w:rPr>
-        <w:t> </w:t>
+        <w:t xml:space="preserve"> </w:t>
       </w:r>
       <w:r>
         <w:rPr/>
@@ -421,7 +418,7 @@
         <w:rPr>
           <w:spacing w:val="-4"/>
         </w:rPr>
-        <w:t> </w:t>
+        <w:t xml:space="preserve"> </w:t>
       </w:r>
       <w:r>
         <w:rPr/>
@@ -431,7 +428,7 @@
         <w:rPr>
           <w:spacing w:val="-4"/>
         </w:rPr>
-        <w:t> </w:t>
+        <w:t xml:space="preserve"> </w:t>
       </w:r>
       <w:r>
         <w:rPr/>
@@ -441,7 +438,7 @@
         <w:rPr>
           <w:spacing w:val="-4"/>
         </w:rPr>
-        <w:t> </w:t>
+        <w:t xml:space="preserve"> </w:t>
       </w:r>
       <w:r>
         <w:rPr/>
@@ -451,7 +448,7 @@
         <w:rPr>
           <w:spacing w:val="-4"/>
         </w:rPr>
-        <w:t> </w:t>
+        <w:t xml:space="preserve"> </w:t>
       </w:r>
       <w:r>
         <w:rPr/>
@@ -461,7 +458,7 @@
         <w:rPr>
           <w:spacing w:val="-4"/>
         </w:rPr>
-        <w:t> </w:t>
+        <w:t xml:space="preserve"> </w:t>
       </w:r>
       <w:r>
         <w:rPr/>
@@ -471,7 +468,7 @@
         <w:rPr>
           <w:spacing w:val="-4"/>
         </w:rPr>
-        <w:t> </w:t>
+        <w:t xml:space="preserve"> </w:t>
       </w:r>
       <w:r>
         <w:rPr/>
@@ -481,7 +478,7 @@
         <w:rPr>
           <w:spacing w:val="-4"/>
         </w:rPr>
-        <w:t> </w:t>
+        <w:t xml:space="preserve"> </w:t>
       </w:r>
       <w:r>
         <w:rPr/>
@@ -491,7 +488,7 @@
         <w:rPr>
           <w:spacing w:val="-4"/>
         </w:rPr>
-        <w:t> </w:t>
+        <w:t xml:space="preserve"> </w:t>
       </w:r>
       <w:r>
         <w:rPr/>
@@ -501,7 +498,7 @@
         <w:rPr>
           <w:spacing w:val="-4"/>
         </w:rPr>
-        <w:t> </w:t>
+        <w:t xml:space="preserve"> </w:t>
       </w:r>
       <w:r>
         <w:rPr/>
@@ -511,7 +508,7 @@
         <w:rPr>
           <w:spacing w:val="-4"/>
         </w:rPr>
-        <w:t> </w:t>
+        <w:t xml:space="preserve"> </w:t>
       </w:r>
       <w:r>
         <w:rPr/>
@@ -521,7 +518,7 @@
         <w:rPr>
           <w:spacing w:val="-4"/>
         </w:rPr>
-        <w:t> </w:t>
+        <w:t xml:space="preserve"> </w:t>
       </w:r>
       <w:r>
         <w:rPr/>
@@ -531,36 +528,38 @@
     <w:p>
       <w:pPr>
         <w:pStyle w:val="BodyText"/>
-        <w:ind w:right="824"/>
+        <w:ind w:left="360" w:right="824"/>
+        <w:rPr/>
       </w:pPr>
       <w:r>
         <w:rPr>
-          <w:b/>
+          <w:b w:val="false"/>
+          <w:bCs w:val="false"/>
         </w:rPr>
         <w:t>Section</w:t>
       </w:r>
       <w:r>
         <w:rPr>
-          <w:b/>
-          <w:spacing w:val="-3"/>
-        </w:rPr>
-        <w:t> </w:t>
-      </w:r>
-      <w:r>
-        <w:rPr>
-          <w:b/>
-        </w:rPr>
-        <w:t>Three</w:t>
-      </w:r>
-      <w:r>
-        <w:rPr/>
-        <w:t>:</w:t>
-      </w:r>
-      <w:r>
-        <w:rPr>
-          <w:spacing w:val="-3"/>
-        </w:rPr>
-        <w:t> </w:t>
+          <w:b w:val="false"/>
+          <w:bCs w:val="false"/>
+          <w:spacing w:val="-3"/>
+        </w:rPr>
+        <w:t xml:space="preserve"> </w:t>
+      </w:r>
+      <w:r>
+        <w:rPr>
+          <w:b w:val="false"/>
+          <w:bCs w:val="false"/>
+        </w:rPr>
+        <w:t>Three:</w:t>
+      </w:r>
+      <w:r>
+        <w:rPr>
+          <w:b w:val="false"/>
+          <w:bCs w:val="false"/>
+          <w:spacing w:val="-3"/>
+        </w:rPr>
+        <w:t xml:space="preserve"> </w:t>
       </w:r>
       <w:r>
         <w:rPr/>
@@ -570,7 +569,7 @@
         <w:rPr>
           <w:spacing w:val="-3"/>
         </w:rPr>
-        <w:t> </w:t>
+        <w:t xml:space="preserve"> </w:t>
       </w:r>
       <w:r>
         <w:rPr/>
@@ -580,7 +579,7 @@
         <w:rPr>
           <w:spacing w:val="-3"/>
         </w:rPr>
-        <w:t> </w:t>
+        <w:t xml:space="preserve"> </w:t>
       </w:r>
       <w:r>
         <w:rPr/>
@@ -590,7 +589,7 @@
         <w:rPr>
           <w:spacing w:val="-3"/>
         </w:rPr>
-        <w:t> </w:t>
+        <w:t xml:space="preserve"> </w:t>
       </w:r>
       <w:r>
         <w:rPr/>
@@ -600,7 +599,7 @@
         <w:rPr>
           <w:spacing w:val="-3"/>
         </w:rPr>
-        <w:t> </w:t>
+        <w:t xml:space="preserve"> </w:t>
       </w:r>
       <w:r>
         <w:rPr/>
@@ -610,7 +609,7 @@
         <w:rPr>
           <w:spacing w:val="-3"/>
         </w:rPr>
-        <w:t> </w:t>
+        <w:t xml:space="preserve"> </w:t>
       </w:r>
       <w:r>
         <w:rPr/>
@@ -620,7 +619,7 @@
         <w:rPr>
           <w:spacing w:val="-3"/>
         </w:rPr>
-        <w:t> </w:t>
+        <w:t xml:space="preserve"> </w:t>
       </w:r>
       <w:r>
         <w:rPr/>
@@ -630,7 +629,7 @@
         <w:rPr>
           <w:spacing w:val="-3"/>
         </w:rPr>
-        <w:t> </w:t>
+        <w:t xml:space="preserve"> </w:t>
       </w:r>
       <w:r>
         <w:rPr/>
@@ -640,7 +639,7 @@
         <w:rPr>
           <w:spacing w:val="-3"/>
         </w:rPr>
-        <w:t> </w:t>
+        <w:t xml:space="preserve"> </w:t>
       </w:r>
       <w:r>
         <w:rPr/>
@@ -650,7 +649,7 @@
         <w:rPr>
           <w:spacing w:val="-3"/>
         </w:rPr>
-        <w:t> </w:t>
+        <w:t xml:space="preserve"> </w:t>
       </w:r>
       <w:r>
         <w:rPr/>
@@ -660,7 +659,7 @@
         <w:rPr>
           <w:spacing w:val="-3"/>
         </w:rPr>
-        <w:t> </w:t>
+        <w:t xml:space="preserve"> </w:t>
       </w:r>
       <w:r>
         <w:rPr/>
@@ -670,7 +669,7 @@
         <w:rPr>
           <w:spacing w:val="-3"/>
         </w:rPr>
-        <w:t> </w:t>
+        <w:t xml:space="preserve"> </w:t>
       </w:r>
       <w:r>
         <w:rPr/>
@@ -680,7 +679,7 @@
         <w:rPr>
           <w:spacing w:val="-3"/>
         </w:rPr>
-        <w:t> </w:t>
+        <w:t xml:space="preserve"> </w:t>
       </w:r>
       <w:r>
         <w:rPr/>
@@ -690,7 +689,7 @@
         <w:rPr>
           <w:spacing w:val="-3"/>
         </w:rPr>
-        <w:t> </w:t>
+        <w:t xml:space="preserve"> </w:t>
       </w:r>
       <w:r>
         <w:rPr/>
@@ -700,7 +699,7 @@
         <w:rPr>
           <w:spacing w:val="-3"/>
         </w:rPr>
-        <w:t> </w:t>
+        <w:t xml:space="preserve"> </w:t>
       </w:r>
       <w:r>
         <w:rPr/>
@@ -710,6 +709,7 @@
     <w:p>
       <w:pPr>
         <w:pStyle w:val="BodyText"/>
+        <w:rPr/>
       </w:pPr>
       <w:r>
         <w:rPr>
@@ -721,14 +721,8 @@
     <w:p>
       <w:pPr>
         <w:pStyle w:val="BodyText"/>
-        <w:spacing w:before="8"/>
-        <w:ind w:left="0"/>
+        <w:rPr/>
       </w:pPr>
-    </w:p>
-    <w:p>
-      <w:pPr>
-        <w:pStyle w:val="Heading1"/>
-      </w:pPr>
       <w:r>
         <w:rPr>
           <w:spacing w:val="-2"/>
@@ -737,33 +731,9 @@
       </w:r>
       <w:r>
         <w:rPr>
-          <w:spacing w:val="-22"/>
-        </w:rPr>
-        <w:t> </w:t>
-      </w:r>
-      <w:r>
-        <w:rPr>
-          <w:spacing w:val="-2"/>
-        </w:rPr>
-        <w:t>Seawolf</w:t>
-      </w:r>
-    </w:p>
-    <w:p>
-      <w:pPr>
-        <w:pStyle w:val="BodyText"/>
-        <w:spacing w:before="380"/>
-      </w:pPr>
-      <w:r>
-        <w:rPr>
-          <w:spacing w:val="-2"/>
-        </w:rPr>
-        <w:t>Wolfie</w:t>
-      </w:r>
-      <w:r>
-        <w:rPr>
           <w:spacing w:val="-8"/>
         </w:rPr>
-        <w:t> </w:t>
+        <w:t xml:space="preserve"> </w:t>
       </w:r>
       <w:r>
         <w:rPr>
@@ -773,91 +743,56 @@
       </w:r>
     </w:p>
     <w:sectPr>
-      <w:type w:val="continuous"/>
+      <w:type w:val="nextPage"/>
       <w:pgSz w:w="12240" w:h="15840"/>
-      <w:pgMar w:top="1380" w:bottom="280" w:left="1080" w:right="720"/>
+      <w:pgMar w:left="1080" w:right="720" w:gutter="0" w:header="0" w:top="1380" w:footer="0" w:bottom="280"/>
+      <w:pgNumType w:fmt="decimal"/>
+      <w:formProt w:val="false"/>
+      <w:textDirection w:val="lrTb"/>
+      <w:docGrid w:type="default" w:linePitch="100" w:charSpace="4096"/>
     </w:sectPr>
   </w:body>
 </w:document>
 </file>
 
 <file path=word/styles.xml><?xml version="1.0" encoding="utf-8"?>
-<w:styles xmlns:r="http://schemas.openxmlformats.org/officeDocument/2006/relationships" xmlns:w="http://schemas.openxmlformats.org/wordprocessingml/2006/main">
+<w:styles xmlns:w="http://schemas.openxmlformats.org/wordprocessingml/2006/main" xmlns:w14="http://schemas.microsoft.com/office/word/2010/wordml" xmlns:mc="http://schemas.openxmlformats.org/markup-compatibility/2006" mc:Ignorable="w14">
   <w:docDefaults>
     <w:rPrDefault>
       <w:rPr>
-        <w:rFonts w:cstheme="minorBidi" w:hAnsiTheme="minorHAnsi" w:eastAsiaTheme="minorHAnsi" w:asciiTheme="minorHAnsi"/>
+        <w:rFonts w:ascii="Calibri" w:hAnsi="Calibri" w:eastAsia="Calibri" w:cs="" w:asciiTheme="minorHAnsi" w:cstheme="minorBidi" w:eastAsiaTheme="minorHAnsi" w:hAnsiTheme="minorHAnsi"/>
         <w:sz w:val="22"/>
         <w:szCs w:val="22"/>
-        <w:lang w:val="en-US" w:bidi="ar-SA" w:eastAsia="en-US"/>
+        <w:lang w:val="en-US" w:eastAsia="en-US" w:bidi="ar-SA"/>
       </w:rPr>
     </w:rPrDefault>
     <w:pPrDefault>
       <w:pPr>
-        <w:widowControl w:val="0"/>
-        <w:autoSpaceDE w:val="0"/>
-        <w:autoSpaceDN w:val="0"/>
-        <w:spacing w:lineRule="auto" w:line="240" w:before="0" w:after="0"/>
-        <w:ind w:left="0" w:right="0"/>
-        <w:jc w:val="left"/>
+        <w:suppressAutoHyphens w:val="true"/>
       </w:pPr>
     </w:pPrDefault>
   </w:docDefaults>
-  <w:style w:styleId="DefaultParagraphFont" w:default="1" w:type="character">
-    <w:name w:val="Default Paragraph Font"/>
-    <w:uiPriority w:val="1"/>
-    <w:semiHidden/>
-    <w:unhideWhenUsed/>
-  </w:style>
-  <w:style w:styleId="TableNormal" w:default="1" w:type="table">
-    <w:name w:val="Table Normal"/>
-    <w:uiPriority w:val="2"/>
-    <w:semiHidden/>
-    <w:unhideWhenUsed/>
-    <w:qFormat/>
-    <w:tblPr>
-      <w:tblInd w:w="0" w:type="dxa"/>
-      <w:tblCellMar>
-        <w:top w:w="0" w:type="dxa"/>
-        <w:left w:w="0" w:type="dxa"/>
-        <w:bottom w:w="0" w:type="dxa"/>
-        <w:right w:w="0" w:type="dxa"/>
-      </w:tblCellMar>
-    </w:tblPr>
-  </w:style>
-  <w:style w:styleId="NoList" w:default="1" w:type="numbering">
-    <w:name w:val="No List"/>
-    <w:uiPriority w:val="99"/>
-    <w:semiHidden/>
-    <w:unhideWhenUsed/>
-  </w:style>
-  <w:style w:default="1" w:styleId="Normal" w:type="paragraph">
+  <w:style w:type="paragraph" w:styleId="Normal" w:default="1">
     <w:name w:val="Normal"/>
     <w:uiPriority w:val="1"/>
     <w:qFormat/>
-    <w:pPr/>
-    <w:rPr>
-      <w:rFonts w:ascii="Times New Roman" w:hAnsi="Times New Roman" w:eastAsia="Times New Roman" w:cs="Times New Roman"/>
-      <w:lang w:val="en-US" w:eastAsia="en-US" w:bidi="ar-SA"/>
-    </w:rPr>
-  </w:style>
-  <w:style w:styleId="BodyText" w:type="paragraph">
-    <w:name w:val="Body Text"/>
-    <w:basedOn w:val="Normal"/>
-    <w:uiPriority w:val="1"/>
-    <w:qFormat/>
     <w:pPr>
-      <w:spacing w:before="276"/>
-      <w:ind w:left="360"/>
+      <w:widowControl w:val="false"/>
+      <w:bidi w:val="0"/>
+      <w:spacing w:lineRule="auto" w:line="240" w:before="0" w:after="0"/>
+      <w:ind w:left="0" w:right="0"/>
+      <w:jc w:val="left"/>
     </w:pPr>
     <w:rPr>
       <w:rFonts w:ascii="Times New Roman" w:hAnsi="Times New Roman" w:eastAsia="Times New Roman" w:cs="Times New Roman"/>
-      <w:sz w:val="24"/>
-      <w:szCs w:val="24"/>
+      <w:color w:val="auto"/>
+      <w:kern w:val="0"/>
+      <w:sz w:val="22"/>
+      <w:szCs w:val="22"/>
       <w:lang w:val="en-US" w:eastAsia="en-US" w:bidi="ar-SA"/>
     </w:rPr>
   </w:style>
-  <w:style w:styleId="Heading1" w:type="paragraph">
+  <w:style w:type="paragraph" w:styleId="Heading1">
     <w:name w:val="Heading 1"/>
     <w:basedOn w:val="Normal"/>
     <w:uiPriority w:val="1"/>
@@ -875,13 +810,13 @@
       <w:lang w:val="en-US" w:eastAsia="en-US" w:bidi="ar-SA"/>
     </w:rPr>
   </w:style>
-  <w:style w:styleId="Heading2" w:type="paragraph">
+  <w:style w:type="paragraph" w:styleId="Heading2">
     <w:name w:val="Heading 2"/>
     <w:basedOn w:val="Normal"/>
     <w:uiPriority w:val="1"/>
     <w:qFormat/>
     <w:pPr>
-      <w:spacing w:before="60"/>
+      <w:spacing w:before="60" w:after="0"/>
       <w:ind w:right="358"/>
       <w:jc w:val="center"/>
       <w:outlineLvl w:val="2"/>
@@ -895,7 +830,88 @@
       <w:lang w:val="en-US" w:eastAsia="en-US" w:bidi="ar-SA"/>
     </w:rPr>
   </w:style>
-  <w:style w:styleId="ListParagraph" w:type="paragraph">
+  <w:style w:type="character" w:styleId="DefaultParagraphFont" w:default="1">
+    <w:name w:val="Default Paragraph Font"/>
+    <w:uiPriority w:val="1"/>
+    <w:semiHidden/>
+    <w:unhideWhenUsed/>
+    <w:qFormat/>
+    <w:rPr/>
+  </w:style>
+  <w:style w:type="character" w:styleId="Hyperlink">
+    <w:name w:val="Hyperlink"/>
+    <w:rPr>
+      <w:color w:val="000080"/>
+      <w:u w:val="single"/>
+    </w:rPr>
+  </w:style>
+  <w:style w:type="paragraph" w:styleId="Heading">
+    <w:name w:val="Heading"/>
+    <w:basedOn w:val="Normal"/>
+    <w:next w:val="BodyText"/>
+    <w:qFormat/>
+    <w:pPr>
+      <w:keepNext w:val="true"/>
+      <w:spacing w:before="240" w:after="120"/>
+    </w:pPr>
+    <w:rPr>
+      <w:rFonts w:ascii="Liberation Sans" w:hAnsi="Liberation Sans" w:eastAsia="Noto Sans CJK SC" w:cs="Noto Sans Devanagari"/>
+      <w:sz w:val="28"/>
+      <w:szCs w:val="28"/>
+    </w:rPr>
+  </w:style>
+  <w:style w:type="paragraph" w:styleId="BodyText">
+    <w:name w:val="Body Text"/>
+    <w:basedOn w:val="Normal"/>
+    <w:uiPriority w:val="1"/>
+    <w:qFormat/>
+    <w:pPr>
+      <w:spacing w:before="276" w:after="0"/>
+      <w:ind w:left="360"/>
+    </w:pPr>
+    <w:rPr>
+      <w:rFonts w:ascii="Times New Roman" w:hAnsi="Times New Roman" w:eastAsia="Times New Roman" w:cs="Times New Roman"/>
+      <w:sz w:val="24"/>
+      <w:szCs w:val="24"/>
+      <w:lang w:val="en-US" w:eastAsia="en-US" w:bidi="ar-SA"/>
+    </w:rPr>
+  </w:style>
+  <w:style w:type="paragraph" w:styleId="List">
+    <w:name w:val="List"/>
+    <w:basedOn w:val="BodyText"/>
+    <w:pPr/>
+    <w:rPr>
+      <w:rFonts w:cs="Noto Sans Devanagari"/>
+    </w:rPr>
+  </w:style>
+  <w:style w:type="paragraph" w:styleId="Caption">
+    <w:name w:val="Caption"/>
+    <w:basedOn w:val="Normal"/>
+    <w:qFormat/>
+    <w:pPr>
+      <w:suppressLineNumbers/>
+      <w:spacing w:before="120" w:after="120"/>
+    </w:pPr>
+    <w:rPr>
+      <w:rFonts w:cs="Noto Sans Devanagari"/>
+      <w:i/>
+      <w:iCs/>
+      <w:sz w:val="24"/>
+      <w:szCs w:val="24"/>
+    </w:rPr>
+  </w:style>
+  <w:style w:type="paragraph" w:styleId="Index">
+    <w:name w:val="Index"/>
+    <w:basedOn w:val="Normal"/>
+    <w:qFormat/>
+    <w:pPr>
+      <w:suppressLineNumbers/>
+    </w:pPr>
+    <w:rPr>
+      <w:rFonts w:cs="Noto Sans Devanagari"/>
+    </w:rPr>
+  </w:style>
+  <w:style w:type="paragraph" w:styleId="ListParagraph">
     <w:name w:val="List Paragraph"/>
     <w:basedOn w:val="Normal"/>
     <w:uiPriority w:val="1"/>
@@ -905,7 +921,7 @@
       <w:lang w:val="en-US" w:eastAsia="en-US" w:bidi="ar-SA"/>
     </w:rPr>
   </w:style>
-  <w:style w:styleId="TableParagraph" w:type="paragraph">
+  <w:style w:type="paragraph" w:styleId="TableParagraph">
     <w:name w:val="Table Paragraph"/>
     <w:basedOn w:val="Normal"/>
     <w:uiPriority w:val="1"/>
@@ -915,45 +931,67 @@
       <w:lang w:val="en-US" w:eastAsia="en-US" w:bidi="ar-SA"/>
     </w:rPr>
   </w:style>
+  <w:style w:type="numbering" w:styleId="NoList" w:default="1">
+    <w:name w:val="No List"/>
+    <w:uiPriority w:val="99"/>
+    <w:semiHidden/>
+    <w:unhideWhenUsed/>
+    <w:qFormat/>
+  </w:style>
+  <w:style w:type="table" w:default="1" w:styleId="TableNormal">
+    <w:name w:val="Table Normal"/>
+    <w:uiPriority w:val="2"/>
+    <w:semiHidden/>
+    <w:unhideWhenUsed/>
+    <w:qFormat/>
+    <w:tblPr>
+      <w:tblCellMar>
+        <w:top w:w="0" w:type="dxa"/>
+        <w:left w:w="0" w:type="dxa"/>
+        <w:bottom w:w="0" w:type="dxa"/>
+        <w:right w:w="0" w:type="dxa"/>
+      </w:tblCellMar>
+    </w:tblPr>
+  </w:style>
 </w:styles>
 </file>
 
 <file path=word/theme/theme1.xml><?xml version="1.0" encoding="utf-8"?>
-<a:theme xmlns:a="http://schemas.openxmlformats.org/drawingml/2006/main" name="Office Theme">
+<a:theme xmlns:a="http://schemas.openxmlformats.org/drawingml/2006/main" xmlns:r="http://schemas.openxmlformats.org/officeDocument/2006/relationships" name="Office Theme">
   <a:themeElements>
     <a:clrScheme name="Office">
       <a:dk1>
-        <a:sysClr val="windowText" lastClr="000000"/>
+        <a:srgbClr val="000000"/>
       </a:dk1>
       <a:lt1>
-        <a:sysClr val="window" lastClr="FFFFFF"/>
+        <a:srgbClr val="ffffff"/>
       </a:lt1>
       <a:dk2>
-        <a:srgbClr val="1F497D"/>
+        <a:srgbClr val="1f497d"/>
       </a:dk2>
       <a:lt2>
-        <a:srgbClr val="EEECE1"/>
+        <a:srgbClr val="eeece1"/>
       </a:lt2>
       <a:accent1>
-        <a:srgbClr val="4F81BD"/>
+        <a:srgbClr val="4f81bd"/>
       </a:accent1>
       <a:accent2>
-        <a:srgbClr val="C0504D"/>
+        <a:srgbClr val="c0504d"/>
       </a:accent2>
       <a:accent3>
-        <a:srgbClr val="9BBB59"/>
+        <a:srgbClr val="9bbb59"/>
       </a:accent3>
       <a:accent4>
-        <a:srgbClr val="8064A2"/>
+        <a:srgbClr val="8064a2"/>
       </a:accent4>
       <a:accent5>
-        <a:srgbClr val="4BACC6"/>
+        <a:srgbClr val="4bacc6"/>
       </a:accent5>
       <a:accent6>
-        <a:srgbClr val="F79646"/>
+        <a:srgbClr val="f79646"/>
       </a:accent6>
       <a:hlink>
-        <a:srgbClr val="0000FF"/>
+        <a:srgbClr val="0000ff"/>
       </a:hlink>
       <a:folHlink>
         <a:srgbClr val="800080"/>
@@ -961,242 +999,134 @@
     </a:clrScheme>
     <a:fontScheme name="Office">
       <a:majorFont>
-        <a:latin typeface="Cambria"/>
+        <a:latin typeface="Cambria" pitchFamily="0" charset="1"/>
         <a:ea typeface=""/>
         <a:cs typeface=""/>
-        <a:font script="Jpan" typeface="ＭＳ ゴシック"/>
-        <a:font script="Hang" typeface="맑은 고딕"/>
-        <a:font script="Hans" typeface="宋体"/>
-        <a:font script="Hant" typeface="新細明體"/>
-        <a:font script="Arab" typeface="Times New Roman"/>
-        <a:font script="Hebr" typeface="Times New Roman"/>
-        <a:font script="Thai" typeface="Angsana New"/>
-        <a:font script="Ethi" typeface="Nyala"/>
-        <a:font script="Beng" typeface="Vrinda"/>
-        <a:font script="Gujr" typeface="Shruti"/>
-        <a:font script="Khmr" typeface="MoolBoran"/>
-        <a:font script="Knda" typeface="Tunga"/>
-        <a:font script="Guru" typeface="Raavi"/>
-        <a:font script="Cans" typeface="Euphemia"/>
-        <a:font script="Cher" typeface="Plantagenet Cherokee"/>
-        <a:font script="Yiii" typeface="Microsoft Yi Baiti"/>
-        <a:font script="Tibt" typeface="Microsoft Himalaya"/>
-        <a:font script="Thaa" typeface="MV Boli"/>
-        <a:font script="Deva" typeface="Mangal"/>
-        <a:font script="Telu" typeface="Gautami"/>
-        <a:font script="Taml" typeface="Latha"/>
-        <a:font script="Syrc" typeface="Estrangelo Edessa"/>
-        <a:font script="Orya" typeface="Kalinga"/>
-        <a:font script="Mlym" typeface="Kartika"/>
-        <a:font script="Laoo" typeface="DokChampa"/>
-        <a:font script="Sinh" typeface="Iskoola Pota"/>
-        <a:font script="Mong" typeface="Mongolian Baiti"/>
-        <a:font script="Viet" typeface="Times New Roman"/>
-        <a:font script="Uigh" typeface="Microsoft Uighur"/>
       </a:majorFont>
       <a:minorFont>
-        <a:latin typeface="Calibri"/>
+        <a:latin typeface="Calibri" pitchFamily="0" charset="1"/>
         <a:ea typeface=""/>
         <a:cs typeface=""/>
-        <a:font script="Jpan" typeface="ＭＳ 明朝"/>
-        <a:font script="Hang" typeface="맑은 고딕"/>
-        <a:font script="Hans" typeface="宋体"/>
-        <a:font script="Hant" typeface="新細明體"/>
-        <a:font script="Arab" typeface="Arial"/>
-        <a:font script="Hebr" typeface="Arial"/>
-        <a:font script="Thai" typeface="Cordia New"/>
-        <a:font script="Ethi" typeface="Nyala"/>
-        <a:font script="Beng" typeface="Vrinda"/>
-        <a:font script="Gujr" typeface="Shruti"/>
-        <a:font script="Khmr" typeface="DaunPenh"/>
-        <a:font script="Knda" typeface="Tunga"/>
-        <a:font script="Guru" typeface="Raavi"/>
-        <a:font script="Cans" typeface="Euphemia"/>
-        <a:font script="Cher" typeface="Plantagenet Cherokee"/>
-        <a:font script="Yiii" typeface="Microsoft Yi Baiti"/>
-        <a:font script="Tibt" typeface="Microsoft Himalaya"/>
-        <a:font script="Thaa" typeface="MV Boli"/>
-        <a:font script="Deva" typeface="Mangal"/>
-        <a:font script="Telu" typeface="Gautami"/>
-        <a:font script="Taml" typeface="Latha"/>
-        <a:font script="Syrc" typeface="Estrangelo Edessa"/>
-        <a:font script="Orya" typeface="Kalinga"/>
-        <a:font script="Mlym" typeface="Kartika"/>
-        <a:font script="Laoo" typeface="DokChampa"/>
-        <a:font script="Sinh" typeface="Iskoola Pota"/>
-        <a:font script="Mong" typeface="Mongolian Baiti"/>
-        <a:font script="Viet" typeface="Arial"/>
-        <a:font script="Uigh" typeface="Microsoft Uighur"/>
       </a:minorFont>
     </a:fontScheme>
-    <a:fmtScheme name="Office">
+    <a:fmtScheme>
       <a:fillStyleLst>
         <a:solidFill>
           <a:schemeClr val="phClr"/>
         </a:solidFill>
-        <a:gradFill rotWithShape="1">
+        <a:gradFill>
           <a:gsLst>
             <a:gs pos="0">
               <a:schemeClr val="phClr">
                 <a:tint val="50000"/>
-                <a:satMod val="300000"/>
               </a:schemeClr>
             </a:gs>
             <a:gs pos="35000">
               <a:schemeClr val="phClr">
                 <a:tint val="37000"/>
-                <a:satMod val="300000"/>
               </a:schemeClr>
             </a:gs>
             <a:gs pos="100000">
               <a:schemeClr val="phClr">
                 <a:tint val="15000"/>
-                <a:satMod val="350000"/>
               </a:schemeClr>
             </a:gs>
           </a:gsLst>
           <a:lin ang="16200000" scaled="1"/>
+          <a:tileRect l="0" t="0" r="0" b="0"/>
         </a:gradFill>
-        <a:gradFill rotWithShape="1">
+        <a:gradFill>
           <a:gsLst>
             <a:gs pos="0">
               <a:schemeClr val="phClr">
                 <a:shade val="51000"/>
-                <a:satMod val="130000"/>
               </a:schemeClr>
             </a:gs>
             <a:gs pos="80000">
               <a:schemeClr val="phClr">
                 <a:shade val="93000"/>
-                <a:satMod val="130000"/>
               </a:schemeClr>
             </a:gs>
             <a:gs pos="100000">
               <a:schemeClr val="phClr">
                 <a:shade val="94000"/>
-                <a:satMod val="135000"/>
               </a:schemeClr>
             </a:gs>
           </a:gsLst>
           <a:lin ang="16200000" scaled="0"/>
+          <a:tileRect l="0" t="0" r="0" b="0"/>
         </a:gradFill>
       </a:fillStyleLst>
       <a:lnStyleLst>
         <a:ln w="9525" cap="flat" cmpd="sng" algn="ctr">
-          <a:solidFill>
-            <a:schemeClr val="phClr">
-              <a:shade val="95000"/>
-              <a:satMod val="105000"/>
-            </a:schemeClr>
-          </a:solidFill>
           <a:prstDash val="solid"/>
         </a:ln>
         <a:ln w="25400" cap="flat" cmpd="sng" algn="ctr">
-          <a:solidFill>
-            <a:schemeClr val="phClr"/>
-          </a:solidFill>
           <a:prstDash val="solid"/>
         </a:ln>
         <a:ln w="38100" cap="flat" cmpd="sng" algn="ctr">
-          <a:solidFill>
-            <a:schemeClr val="phClr"/>
-          </a:solidFill>
           <a:prstDash val="solid"/>
         </a:ln>
       </a:lnStyleLst>
       <a:effectStyleLst>
         <a:effectStyle>
-          <a:effectLst>
-            <a:outerShdw blurRad="40000" dist="20000" dir="5400000" rotWithShape="0">
-              <a:srgbClr val="000000">
-                <a:alpha val="38000"/>
-              </a:srgbClr>
-            </a:outerShdw>
-          </a:effectLst>
+          <a:effectLst/>
         </a:effectStyle>
         <a:effectStyle>
-          <a:effectLst>
-            <a:outerShdw blurRad="40000" dist="23000" dir="5400000" rotWithShape="0">
-              <a:srgbClr val="000000">
-                <a:alpha val="35000"/>
-              </a:srgbClr>
-            </a:outerShdw>
-          </a:effectLst>
+          <a:effectLst/>
         </a:effectStyle>
         <a:effectStyle>
-          <a:effectLst>
-            <a:outerShdw blurRad="40000" dist="23000" dir="5400000" rotWithShape="0">
-              <a:srgbClr val="000000">
-                <a:alpha val="35000"/>
-              </a:srgbClr>
-            </a:outerShdw>
-          </a:effectLst>
-          <a:scene3d>
-            <a:camera prst="orthographicFront">
-              <a:rot lat="0" lon="0" rev="0"/>
-            </a:camera>
-            <a:lightRig rig="threePt" dir="t">
-              <a:rot lat="0" lon="0" rev="1200000"/>
-            </a:lightRig>
-          </a:scene3d>
-          <a:sp3d>
-            <a:bevelT w="63500" h="25400"/>
-          </a:sp3d>
+          <a:effectLst/>
         </a:effectStyle>
       </a:effectStyleLst>
       <a:bgFillStyleLst>
         <a:solidFill>
           <a:schemeClr val="phClr"/>
         </a:solidFill>
-        <a:gradFill rotWithShape="1">
+        <a:gradFill>
           <a:gsLst>
             <a:gs pos="0">
               <a:schemeClr val="phClr">
                 <a:tint val="40000"/>
-                <a:satMod val="350000"/>
               </a:schemeClr>
             </a:gs>
             <a:gs pos="40000">
               <a:schemeClr val="phClr">
                 <a:tint val="45000"/>
                 <a:shade val="99000"/>
-                <a:satMod val="350000"/>
               </a:schemeClr>
             </a:gs>
             <a:gs pos="100000">
               <a:schemeClr val="phClr">
                 <a:shade val="20000"/>
-                <a:satMod val="255000"/>
               </a:schemeClr>
             </a:gs>
           </a:gsLst>
           <a:path path="circle">
             <a:fillToRect l="50000" t="-80000" r="50000" b="180000"/>
           </a:path>
+          <a:tileRect l="0" t="0" r="0" b="0"/>
         </a:gradFill>
-        <a:gradFill rotWithShape="1">
+        <a:gradFill>
           <a:gsLst>
             <a:gs pos="0">
               <a:schemeClr val="phClr">
                 <a:tint val="80000"/>
-                <a:satMod val="300000"/>
               </a:schemeClr>
             </a:gs>
             <a:gs pos="100000">
               <a:schemeClr val="phClr">
                 <a:shade val="30000"/>
-                <a:satMod val="200000"/>
               </a:schemeClr>
             </a:gs>
           </a:gsLst>
           <a:path path="circle">
             <a:fillToRect l="50000" t="50000" r="50000" b="50000"/>
           </a:path>
+          <a:tileRect l="0" t="0" r="0" b="0"/>
         </a:gradFill>
       </a:bgFillStyleLst>
     </a:fmtScheme>
   </a:themeElements>
-  <a:objectDefaults/>
-  <a:extraClrSchemeLst/>
 </a:theme>
 </file>
</xml_diff>

<commit_message>
another cover letter improvement attempt:
</commit_message>
<xml_diff>
--- a/templates/default_cover_letter_template.docx
+++ b/templates/default_cover_letter_template.docx
@@ -227,119 +227,157 @@
       </w:pPr>
       <w:r>
         <w:rPr>
-          <w:b/>
+          <w:b w:val="0"/>
         </w:rPr>
         <w:t>[Intro — 1–2 sentences. Specific, not generic. Why this role at this company, grounded in your real background.]</w:t>
       </w:r>
       <w:r>
         <w:rPr>
-          <w:b/>
-          <w:spacing w:val="-4"/>
-        </w:rPr>
-      </w:r>
-      <w:r>
-        <w:rPr>
-          <w:b/>
-        </w:rPr>
-      </w:r>
-      <w:r>
-        <w:rPr/>
-      </w:r>
-      <w:r>
-        <w:rPr>
-          <w:spacing w:val="-4"/>
-        </w:rPr>
-      </w:r>
-      <w:r>
-        <w:rPr/>
-      </w:r>
-      <w:r>
-        <w:rPr>
-          <w:spacing w:val="-4"/>
-        </w:rPr>
-      </w:r>
-      <w:r>
-        <w:rPr/>
-      </w:r>
-      <w:r>
-        <w:rPr>
-          <w:spacing w:val="-4"/>
-        </w:rPr>
-      </w:r>
-      <w:r>
-        <w:rPr/>
-      </w:r>
-      <w:r>
-        <w:rPr>
+          <w:b w:val="0"/>
+          <w:spacing w:val="-4"/>
+        </w:rPr>
+      </w:r>
+      <w:r>
+        <w:rPr>
+          <w:b w:val="0"/>
+        </w:rPr>
+      </w:r>
+      <w:r>
+        <w:rPr>
+          <w:b w:val="0"/>
+        </w:rPr>
+      </w:r>
+      <w:r>
+        <w:rPr>
+          <w:b w:val="0"/>
+          <w:spacing w:val="-4"/>
+        </w:rPr>
+      </w:r>
+      <w:r>
+        <w:rPr>
+          <w:b w:val="0"/>
+        </w:rPr>
+      </w:r>
+      <w:r>
+        <w:rPr>
+          <w:b w:val="0"/>
+          <w:spacing w:val="-4"/>
+        </w:rPr>
+      </w:r>
+      <w:r>
+        <w:rPr>
+          <w:b w:val="0"/>
+        </w:rPr>
+      </w:r>
+      <w:r>
+        <w:rPr>
+          <w:b w:val="0"/>
+          <w:spacing w:val="-4"/>
+        </w:rPr>
+      </w:r>
+      <w:r>
+        <w:rPr>
+          <w:b w:val="0"/>
+        </w:rPr>
+      </w:r>
+      <w:r>
+        <w:rPr>
+          <w:b w:val="0"/>
           <w:spacing w:val="40"/>
         </w:rPr>
       </w:r>
       <w:r>
-        <w:rPr/>
-      </w:r>
-      <w:r>
-        <w:rPr>
-          <w:spacing w:val="-4"/>
-        </w:rPr>
-      </w:r>
-      <w:r>
-        <w:rPr/>
-      </w:r>
-      <w:r>
-        <w:rPr>
-          <w:spacing w:val="-4"/>
-        </w:rPr>
-      </w:r>
-      <w:r>
-        <w:rPr/>
-      </w:r>
-      <w:r>
-        <w:rPr>
-          <w:spacing w:val="-4"/>
-        </w:rPr>
-      </w:r>
-      <w:r>
-        <w:rPr/>
-      </w:r>
-      <w:r>
-        <w:rPr>
-          <w:spacing w:val="-4"/>
-        </w:rPr>
-      </w:r>
-      <w:r>
-        <w:rPr/>
-      </w:r>
-      <w:r>
-        <w:rPr>
-          <w:spacing w:val="-4"/>
-        </w:rPr>
-      </w:r>
-      <w:r>
-        <w:rPr/>
-      </w:r>
-      <w:r>
-        <w:rPr>
-          <w:spacing w:val="-4"/>
-        </w:rPr>
-      </w:r>
-      <w:r>
-        <w:rPr/>
-      </w:r>
-      <w:r>
-        <w:rPr>
-          <w:spacing w:val="-4"/>
-        </w:rPr>
-      </w:r>
-      <w:r>
-        <w:rPr/>
-      </w:r>
-      <w:r>
-        <w:rPr>
-          <w:spacing w:val="-4"/>
-        </w:rPr>
-      </w:r>
-      <w:r>
-        <w:rPr/>
+        <w:rPr>
+          <w:b w:val="0"/>
+        </w:rPr>
+      </w:r>
+      <w:r>
+        <w:rPr>
+          <w:b w:val="0"/>
+          <w:spacing w:val="-4"/>
+        </w:rPr>
+      </w:r>
+      <w:r>
+        <w:rPr>
+          <w:b w:val="0"/>
+        </w:rPr>
+      </w:r>
+      <w:r>
+        <w:rPr>
+          <w:b w:val="0"/>
+          <w:spacing w:val="-4"/>
+        </w:rPr>
+      </w:r>
+      <w:r>
+        <w:rPr>
+          <w:b w:val="0"/>
+        </w:rPr>
+      </w:r>
+      <w:r>
+        <w:rPr>
+          <w:b w:val="0"/>
+          <w:spacing w:val="-4"/>
+        </w:rPr>
+      </w:r>
+      <w:r>
+        <w:rPr>
+          <w:b w:val="0"/>
+        </w:rPr>
+      </w:r>
+      <w:r>
+        <w:rPr>
+          <w:b w:val="0"/>
+          <w:spacing w:val="-4"/>
+        </w:rPr>
+      </w:r>
+      <w:r>
+        <w:rPr>
+          <w:b w:val="0"/>
+        </w:rPr>
+      </w:r>
+      <w:r>
+        <w:rPr>
+          <w:b w:val="0"/>
+          <w:spacing w:val="-4"/>
+        </w:rPr>
+      </w:r>
+      <w:r>
+        <w:rPr>
+          <w:b w:val="0"/>
+        </w:rPr>
+      </w:r>
+      <w:r>
+        <w:rPr>
+          <w:b w:val="0"/>
+          <w:spacing w:val="-4"/>
+        </w:rPr>
+      </w:r>
+      <w:r>
+        <w:rPr>
+          <w:b w:val="0"/>
+        </w:rPr>
+      </w:r>
+      <w:r>
+        <w:rPr>
+          <w:b w:val="0"/>
+          <w:spacing w:val="-4"/>
+        </w:rPr>
+      </w:r>
+      <w:r>
+        <w:rPr>
+          <w:b w:val="0"/>
+        </w:rPr>
+      </w:r>
+      <w:r>
+        <w:rPr>
+          <w:b w:val="0"/>
+          <w:spacing w:val="-4"/>
+        </w:rPr>
+      </w:r>
+      <w:r>
+        <w:rPr>
+          <w:b w:val="0"/>
+        </w:rPr>
       </w:r>
     </w:p>
     <w:p>
@@ -349,127 +387,168 @@
       </w:pPr>
       <w:r>
         <w:rPr>
-          <w:b/>
+          <w:b w:val="0"/>
         </w:rPr>
         <w:t>[Evidence — 2–3 concrete examples from your experience that directly match what this job needs.]</w:t>
       </w:r>
       <w:r>
         <w:rPr>
-          <w:b/>
-          <w:spacing w:val="-4"/>
-        </w:rPr>
-      </w:r>
-      <w:r>
-        <w:rPr>
-          <w:b/>
-        </w:rPr>
-      </w:r>
-      <w:r>
-        <w:rPr/>
-      </w:r>
-      <w:r>
-        <w:rPr>
-          <w:spacing w:val="-4"/>
-        </w:rPr>
-      </w:r>
-      <w:r>
-        <w:rPr/>
-      </w:r>
-      <w:r>
-        <w:rPr>
-          <w:spacing w:val="-4"/>
-        </w:rPr>
-      </w:r>
-      <w:r>
-        <w:rPr/>
-      </w:r>
-      <w:r>
-        <w:rPr>
-          <w:spacing w:val="-4"/>
-        </w:rPr>
-      </w:r>
-      <w:r>
-        <w:rPr/>
-      </w:r>
-      <w:r>
-        <w:rPr>
-          <w:spacing w:val="-4"/>
-        </w:rPr>
-      </w:r>
-      <w:r>
-        <w:rPr/>
-      </w:r>
-      <w:r>
-        <w:rPr>
-          <w:spacing w:val="-4"/>
-        </w:rPr>
-      </w:r>
-      <w:r>
-        <w:rPr/>
-      </w:r>
-      <w:r>
-        <w:rPr>
-          <w:spacing w:val="-4"/>
-        </w:rPr>
-      </w:r>
-      <w:r>
-        <w:rPr/>
-      </w:r>
-      <w:r>
-        <w:rPr>
-          <w:spacing w:val="-4"/>
-        </w:rPr>
-      </w:r>
-      <w:r>
-        <w:rPr/>
-      </w:r>
-      <w:r>
-        <w:rPr>
-          <w:spacing w:val="-4"/>
-        </w:rPr>
-      </w:r>
-      <w:r>
-        <w:rPr/>
-      </w:r>
-      <w:r>
-        <w:rPr>
-          <w:spacing w:val="-4"/>
-        </w:rPr>
-      </w:r>
-      <w:r>
-        <w:rPr/>
-      </w:r>
-      <w:r>
-        <w:rPr>
-          <w:spacing w:val="-4"/>
-        </w:rPr>
-      </w:r>
-      <w:r>
-        <w:rPr/>
-      </w:r>
-      <w:r>
-        <w:rPr>
-          <w:spacing w:val="-4"/>
-        </w:rPr>
-      </w:r>
-      <w:r>
-        <w:rPr/>
-      </w:r>
-      <w:r>
-        <w:rPr>
-          <w:spacing w:val="-4"/>
-        </w:rPr>
-      </w:r>
-      <w:r>
-        <w:rPr/>
-      </w:r>
-      <w:r>
-        <w:rPr>
-          <w:spacing w:val="-4"/>
-        </w:rPr>
-      </w:r>
-      <w:r>
-        <w:rPr/>
+          <w:b w:val="0"/>
+          <w:spacing w:val="-4"/>
+        </w:rPr>
+      </w:r>
+      <w:r>
+        <w:rPr>
+          <w:b w:val="0"/>
+        </w:rPr>
+      </w:r>
+      <w:r>
+        <w:rPr>
+          <w:b w:val="0"/>
+        </w:rPr>
+      </w:r>
+      <w:r>
+        <w:rPr>
+          <w:b w:val="0"/>
+          <w:spacing w:val="-4"/>
+        </w:rPr>
+      </w:r>
+      <w:r>
+        <w:rPr>
+          <w:b w:val="0"/>
+        </w:rPr>
+      </w:r>
+      <w:r>
+        <w:rPr>
+          <w:b w:val="0"/>
+          <w:spacing w:val="-4"/>
+        </w:rPr>
+      </w:r>
+      <w:r>
+        <w:rPr>
+          <w:b w:val="0"/>
+        </w:rPr>
+      </w:r>
+      <w:r>
+        <w:rPr>
+          <w:b w:val="0"/>
+          <w:spacing w:val="-4"/>
+        </w:rPr>
+      </w:r>
+      <w:r>
+        <w:rPr>
+          <w:b w:val="0"/>
+        </w:rPr>
+      </w:r>
+      <w:r>
+        <w:rPr>
+          <w:b w:val="0"/>
+          <w:spacing w:val="-4"/>
+        </w:rPr>
+      </w:r>
+      <w:r>
+        <w:rPr>
+          <w:b w:val="0"/>
+        </w:rPr>
+      </w:r>
+      <w:r>
+        <w:rPr>
+          <w:b w:val="0"/>
+          <w:spacing w:val="-4"/>
+        </w:rPr>
+      </w:r>
+      <w:r>
+        <w:rPr>
+          <w:b w:val="0"/>
+        </w:rPr>
+      </w:r>
+      <w:r>
+        <w:rPr>
+          <w:b w:val="0"/>
+          <w:spacing w:val="-4"/>
+        </w:rPr>
+      </w:r>
+      <w:r>
+        <w:rPr>
+          <w:b w:val="0"/>
+        </w:rPr>
+      </w:r>
+      <w:r>
+        <w:rPr>
+          <w:b w:val="0"/>
+          <w:spacing w:val="-4"/>
+        </w:rPr>
+      </w:r>
+      <w:r>
+        <w:rPr>
+          <w:b w:val="0"/>
+        </w:rPr>
+      </w:r>
+      <w:r>
+        <w:rPr>
+          <w:b w:val="0"/>
+          <w:spacing w:val="-4"/>
+        </w:rPr>
+      </w:r>
+      <w:r>
+        <w:rPr>
+          <w:b w:val="0"/>
+        </w:rPr>
+      </w:r>
+      <w:r>
+        <w:rPr>
+          <w:b w:val="0"/>
+          <w:spacing w:val="-4"/>
+        </w:rPr>
+      </w:r>
+      <w:r>
+        <w:rPr>
+          <w:b w:val="0"/>
+        </w:rPr>
+      </w:r>
+      <w:r>
+        <w:rPr>
+          <w:b w:val="0"/>
+          <w:spacing w:val="-4"/>
+        </w:rPr>
+      </w:r>
+      <w:r>
+        <w:rPr>
+          <w:b w:val="0"/>
+        </w:rPr>
+      </w:r>
+      <w:r>
+        <w:rPr>
+          <w:b w:val="0"/>
+          <w:spacing w:val="-4"/>
+        </w:rPr>
+      </w:r>
+      <w:r>
+        <w:rPr>
+          <w:b w:val="0"/>
+        </w:rPr>
+      </w:r>
+      <w:r>
+        <w:rPr>
+          <w:b w:val="0"/>
+          <w:spacing w:val="-4"/>
+        </w:rPr>
+      </w:r>
+      <w:r>
+        <w:rPr>
+          <w:b w:val="0"/>
+        </w:rPr>
+      </w:r>
+      <w:r>
+        <w:rPr>
+          <w:b w:val="0"/>
+          <w:spacing w:val="-4"/>
+        </w:rPr>
+      </w:r>
+      <w:r>
+        <w:rPr>
+          <w:b w:val="0"/>
+        </w:rPr>
       </w:r>
     </w:p>
     <w:p>
@@ -479,143 +558,190 @@
       </w:pPr>
       <w:r>
         <w:rPr>
-          <w:b/>
+          <w:b w:val="0"/>
         </w:rPr>
         <w:t>[Close — 1–2 sentences. Optional: omit if the first two paragraphs already feel complete.]</w:t>
       </w:r>
       <w:r>
         <w:rPr>
-          <w:b/>
-          <w:spacing w:val="-3"/>
-        </w:rPr>
-      </w:r>
-      <w:r>
-        <w:rPr>
-          <w:b/>
-        </w:rPr>
-      </w:r>
-      <w:r>
-        <w:rPr/>
-      </w:r>
-      <w:r>
-        <w:rPr>
-          <w:spacing w:val="-3"/>
-        </w:rPr>
-      </w:r>
-      <w:r>
-        <w:rPr/>
-      </w:r>
-      <w:r>
-        <w:rPr>
-          <w:spacing w:val="-3"/>
-        </w:rPr>
-      </w:r>
-      <w:r>
-        <w:rPr/>
-      </w:r>
-      <w:r>
-        <w:rPr>
-          <w:spacing w:val="-3"/>
-        </w:rPr>
-      </w:r>
-      <w:r>
-        <w:rPr/>
-      </w:r>
-      <w:r>
-        <w:rPr>
-          <w:spacing w:val="-3"/>
-        </w:rPr>
-      </w:r>
-      <w:r>
-        <w:rPr/>
-      </w:r>
-      <w:r>
-        <w:rPr>
-          <w:spacing w:val="-3"/>
-        </w:rPr>
-      </w:r>
-      <w:r>
-        <w:rPr/>
-      </w:r>
-      <w:r>
-        <w:rPr>
-          <w:spacing w:val="-3"/>
-        </w:rPr>
-      </w:r>
-      <w:r>
-        <w:rPr/>
-      </w:r>
-      <w:r>
-        <w:rPr>
-          <w:spacing w:val="-3"/>
-        </w:rPr>
-      </w:r>
-      <w:r>
-        <w:rPr/>
-      </w:r>
-      <w:r>
-        <w:rPr>
-          <w:spacing w:val="-3"/>
-        </w:rPr>
-      </w:r>
-      <w:r>
-        <w:rPr/>
-      </w:r>
-      <w:r>
-        <w:rPr>
-          <w:spacing w:val="-3"/>
-        </w:rPr>
-      </w:r>
-      <w:r>
-        <w:rPr/>
-      </w:r>
-      <w:r>
-        <w:rPr>
-          <w:spacing w:val="-3"/>
-        </w:rPr>
-      </w:r>
-      <w:r>
-        <w:rPr/>
-      </w:r>
-      <w:r>
-        <w:rPr>
-          <w:spacing w:val="-3"/>
-        </w:rPr>
-      </w:r>
-      <w:r>
-        <w:rPr/>
-      </w:r>
-      <w:r>
-        <w:rPr>
-          <w:spacing w:val="-3"/>
-        </w:rPr>
-      </w:r>
-      <w:r>
-        <w:rPr/>
-      </w:r>
-      <w:r>
-        <w:rPr>
-          <w:spacing w:val="-3"/>
-        </w:rPr>
-      </w:r>
-      <w:r>
-        <w:rPr/>
-      </w:r>
-      <w:r>
-        <w:rPr>
-          <w:spacing w:val="-3"/>
-        </w:rPr>
-      </w:r>
-      <w:r>
-        <w:rPr/>
-      </w:r>
-      <w:r>
-        <w:rPr>
-          <w:spacing w:val="-3"/>
-        </w:rPr>
-      </w:r>
-      <w:r>
-        <w:rPr/>
+          <w:b w:val="0"/>
+          <w:spacing w:val="-3"/>
+        </w:rPr>
+      </w:r>
+      <w:r>
+        <w:rPr>
+          <w:b w:val="0"/>
+        </w:rPr>
+      </w:r>
+      <w:r>
+        <w:rPr>
+          <w:b w:val="0"/>
+        </w:rPr>
+      </w:r>
+      <w:r>
+        <w:rPr>
+          <w:b w:val="0"/>
+          <w:spacing w:val="-3"/>
+        </w:rPr>
+      </w:r>
+      <w:r>
+        <w:rPr>
+          <w:b w:val="0"/>
+        </w:rPr>
+      </w:r>
+      <w:r>
+        <w:rPr>
+          <w:b w:val="0"/>
+          <w:spacing w:val="-3"/>
+        </w:rPr>
+      </w:r>
+      <w:r>
+        <w:rPr>
+          <w:b w:val="0"/>
+        </w:rPr>
+      </w:r>
+      <w:r>
+        <w:rPr>
+          <w:b w:val="0"/>
+          <w:spacing w:val="-3"/>
+        </w:rPr>
+      </w:r>
+      <w:r>
+        <w:rPr>
+          <w:b w:val="0"/>
+        </w:rPr>
+      </w:r>
+      <w:r>
+        <w:rPr>
+          <w:b w:val="0"/>
+          <w:spacing w:val="-3"/>
+        </w:rPr>
+      </w:r>
+      <w:r>
+        <w:rPr>
+          <w:b w:val="0"/>
+        </w:rPr>
+      </w:r>
+      <w:r>
+        <w:rPr>
+          <w:b w:val="0"/>
+          <w:spacing w:val="-3"/>
+        </w:rPr>
+      </w:r>
+      <w:r>
+        <w:rPr>
+          <w:b w:val="0"/>
+        </w:rPr>
+      </w:r>
+      <w:r>
+        <w:rPr>
+          <w:b w:val="0"/>
+          <w:spacing w:val="-3"/>
+        </w:rPr>
+      </w:r>
+      <w:r>
+        <w:rPr>
+          <w:b w:val="0"/>
+        </w:rPr>
+      </w:r>
+      <w:r>
+        <w:rPr>
+          <w:b w:val="0"/>
+          <w:spacing w:val="-3"/>
+        </w:rPr>
+      </w:r>
+      <w:r>
+        <w:rPr>
+          <w:b w:val="0"/>
+        </w:rPr>
+      </w:r>
+      <w:r>
+        <w:rPr>
+          <w:b w:val="0"/>
+          <w:spacing w:val="-3"/>
+        </w:rPr>
+      </w:r>
+      <w:r>
+        <w:rPr>
+          <w:b w:val="0"/>
+        </w:rPr>
+      </w:r>
+      <w:r>
+        <w:rPr>
+          <w:b w:val="0"/>
+          <w:spacing w:val="-3"/>
+        </w:rPr>
+      </w:r>
+      <w:r>
+        <w:rPr>
+          <w:b w:val="0"/>
+        </w:rPr>
+      </w:r>
+      <w:r>
+        <w:rPr>
+          <w:b w:val="0"/>
+          <w:spacing w:val="-3"/>
+        </w:rPr>
+      </w:r>
+      <w:r>
+        <w:rPr>
+          <w:b w:val="0"/>
+        </w:rPr>
+      </w:r>
+      <w:r>
+        <w:rPr>
+          <w:b w:val="0"/>
+          <w:spacing w:val="-3"/>
+        </w:rPr>
+      </w:r>
+      <w:r>
+        <w:rPr>
+          <w:b w:val="0"/>
+        </w:rPr>
+      </w:r>
+      <w:r>
+        <w:rPr>
+          <w:b w:val="0"/>
+          <w:spacing w:val="-3"/>
+        </w:rPr>
+      </w:r>
+      <w:r>
+        <w:rPr>
+          <w:b w:val="0"/>
+        </w:rPr>
+      </w:r>
+      <w:r>
+        <w:rPr>
+          <w:b w:val="0"/>
+          <w:spacing w:val="-3"/>
+        </w:rPr>
+      </w:r>
+      <w:r>
+        <w:rPr>
+          <w:b w:val="0"/>
+        </w:rPr>
+      </w:r>
+      <w:r>
+        <w:rPr>
+          <w:b w:val="0"/>
+          <w:spacing w:val="-3"/>
+        </w:rPr>
+      </w:r>
+      <w:r>
+        <w:rPr>
+          <w:b w:val="0"/>
+        </w:rPr>
+      </w:r>
+      <w:r>
+        <w:rPr>
+          <w:b w:val="0"/>
+          <w:spacing w:val="-3"/>
+        </w:rPr>
+      </w:r>
+      <w:r>
+        <w:rPr>
+          <w:b w:val="0"/>
+        </w:rPr>
       </w:r>
     </w:p>
     <w:p>
@@ -638,22 +764,28 @@
     </w:p>
     <w:p>
       <w:pPr>
-        <w:pStyle w:val="Heading1"/>
-      </w:pPr>
-      <w:r>
-        <w:rPr>
+        <w:pStyle w:val="BodyText"/>
+      </w:pPr>
+      <w:r>
+        <w:rPr>
+          <w:b w:val="0"/>
+          <w:i w:val="0"/>
           <w:spacing w:val="-2"/>
         </w:rPr>
         <w:t>Wolfie</w:t>
       </w:r>
       <w:r>
         <w:rPr>
+          <w:b w:val="0"/>
+          <w:i w:val="0"/>
           <w:spacing w:val="-22"/>
         </w:rPr>
         <w:t> </w:t>
       </w:r>
       <w:r>
         <w:rPr>
+          <w:b w:val="0"/>
+          <w:i w:val="0"/>
           <w:spacing w:val="-2"/>
         </w:rPr>
         <w:t>Seawolf</w:t>

</xml_diff>